<commit_message>
refactor: enhance handling of bidi visual overrides in issue 157 probes and update related test files
</commit_message>
<xml_diff>
--- a/test-files/issue-157-tblprex-bidi.docx
+++ b/test-files/issue-157-tblprex-bidi.docx
@@ -142,4 +142,28 @@
     </w:sectPr>
   </w:body>
 </w:document>
+</file>
+
+<file path=word/styles.xml><?xml version="1.0" encoding="utf-8"?>
+<w:styles xmlns:w="http://schemas.openxmlformats.org/wordprocessingml/2006/main">
+  <w:docDefaults>
+    <w:rPrDefault>
+      <w:rPr>
+        <w:rFonts w:ascii="Times New Roman" w:hAnsi="Times New Roman" w:eastAsia="Times New Roman" w:cs="Times New Roman"/>
+        <w:kern w:val="2"/>
+        <w:sz w:val="20"/>
+        <w:szCs w:val="20"/>
+      </w:rPr>
+    </w:rPrDefault>
+    <w:pPrDefault>
+      <w:pPr>
+        <w:spacing w:before="0" w:after="0" w:line="240" w:lineRule="auto"/>
+      </w:pPr>
+    </w:pPrDefault>
+  </w:docDefaults>
+  <w:style w:type="paragraph" w:default="1" w:styleId="Normal">
+    <w:name w:val="Normal"/>
+    <w:qFormat/>
+  </w:style>
+</w:styles>
 </file>
</xml_diff>